<commit_message>
docs/examples: Add matching scenario Markdowns and compiled Word (.docx) documents
</commit_message>
<xml_diff>
--- a/examples/chatgpt-export-without-marksmith.docx
+++ b/examples/chatgpt-export-without-marksmith.docx
@@ -262,33 +262,7 @@
             </mc:Choice>
           </mc:AlternateContent>
         </w:rPr>
-        <w:t xml:space="preserve">) by repeatedly stepping in the</w:t>
-      </w:r>
-      <w:r>
-        <w:rPr>
-          <mc:AlternateContent>
-            <mc:Choice Requires="w14">
-              <w14:ligatures w14:val="standardContextual"/>
-              <w14:numForm w14:val="oldStyle"/>
-              <w14:numSpacing w14:val="proportional"/>
-              <w14:cntxtAlts/>
-            </mc:Choice>
-          </mc:AlternateContent>
-        </w:rPr>
-        <w:t xml:space="preserve"> </w:t>
-      </w:r>
-      <w:r>
-        <w:rPr>
-          <mc:AlternateContent>
-            <mc:Choice Requires="w14">
-              <w14:ligatures w14:val="standardContextual"/>
-              <w14:numForm w14:val="oldStyle"/>
-              <w14:numSpacing w14:val="proportional"/>
-              <w14:cntxtAlts/>
-            </mc:Choice>
-          </mc:AlternateContent>
-        </w:rPr>
-        <w:t xml:space="preserve">direction that reduces it fastest — the negative gradient. Each update looks like:</w:t>
+        <w:t xml:space="preserve">) by repeatedly stepping in the direction that reduces it fastest — the negative gradient. Each update looks like:</w:t>
       </w:r>
     </w:p>
     <w:p>
@@ -303,7 +277,33 @@
             </mc:Choice>
           </mc:AlternateContent>
         </w:rPr>
-        <w:t xml:space="preserve">[ \theta</w:t>
+        <w:t xml:space="preserve">[</w:t>
+      </w:r>
+      <w:r>
+        <w:rPr>
+          <mc:AlternateContent>
+            <mc:Choice Requires="w14">
+              <w14:ligatures w14:val="standardContextual"/>
+              <w14:numForm w14:val="oldStyle"/>
+              <w14:numSpacing w14:val="proportional"/>
+              <w14:cntxtAlts/>
+            </mc:Choice>
+          </mc:AlternateContent>
+        </w:rPr>
+        <w:t xml:space="preserve"> </w:t>
+      </w:r>
+      <w:r>
+        <w:rPr>
+          <mc:AlternateContent>
+            <mc:Choice Requires="w14">
+              <w14:ligatures w14:val="standardContextual"/>
+              <w14:numForm w14:val="oldStyle"/>
+              <w14:numSpacing w14:val="proportional"/>
+              <w14:cntxtAlts/>
+            </mc:Choice>
+          </mc:AlternateContent>
+        </w:rPr>
+        <w:t xml:space="preserve">\theta</w:t>
       </w:r>
       <w:r>
         <w:rPr>
@@ -329,20 +329,7 @@
             </mc:Choice>
           </mc:AlternateContent>
         </w:rPr>
-        <w:t xml:space="preserve">{t+1} = \theta_t - \eta </w:t>
-      </w:r>
-      <w:r>
-        <w:rPr>
-          <mc:AlternateContent>
-            <mc:Choice Requires="w14">
-              <w14:ligatures w14:val="standardContextual"/>
-              <w14:numForm w14:val="oldStyle"/>
-              <w14:numSpacing w14:val="proportional"/>
-              <w14:cntxtAlts/>
-            </mc:Choice>
-          </mc:AlternateContent>
-        </w:rPr>
-        <w:t xml:space="preserve">, \nabla</w:t>
+        <w:t xml:space="preserve">{t+1} = \theta_t - \eta \nabla</w:t>
       </w:r>
       <w:r>
         <w:rPr>
@@ -368,7 +355,20 @@
             </mc:Choice>
           </mc:AlternateContent>
         </w:rPr>
-        <w:t xml:space="preserve">\theta L(\theta_t) </w:t>
+        <w:t xml:space="preserve">\theta L(\theta_t)</w:t>
+      </w:r>
+      <w:r>
+        <w:rPr>
+          <mc:AlternateContent>
+            <mc:Choice Requires="w14">
+              <w14:ligatures w14:val="standardContextual"/>
+              <w14:numForm w14:val="oldStyle"/>
+              <w14:numSpacing w14:val="proportional"/>
+              <w14:cntxtAlts/>
+            </mc:Choice>
+          </mc:AlternateContent>
+        </w:rPr>
+        <w:t xml:space="preserve"> </w:t>
       </w:r>
       <w:r>
         <w:rPr>
@@ -454,7 +454,7 @@
     </w:p>
     <w:p>
       <w:pPr>
-        <w:pStyle w:val="Heading2"/>
+        <w:pStyle w:val="Heading3"/>
       </w:pPr>
       <w:bookmarkStart w:name="H_a_minimal_implementation" w:id="2"/>
       <w:r>
@@ -694,7 +694,7 @@
     </w:p>
     <w:p>
       <w:pPr>
-        <w:pStyle w:val="Heading2"/>
+        <w:pStyle w:val="Heading3"/>
       </w:pPr>
       <w:bookmarkStart w:name="H_choosing_the_learning_rate_3sourc" w:id="3"/>
       <w:r>
@@ -883,7 +883,7 @@
     </w:p>
     <w:p>
       <w:pPr>
-        <w:pStyle w:val="Heading2"/>
+        <w:pStyle w:val="Heading3"/>
       </w:pPr>
       <w:bookmarkStart w:name="H_variants_worth_knowing" w:id="4"/>
       <w:r>
@@ -1229,8 +1229,8 @@
       </w:r>
     </w:p>
     <w:sectPr>
-      <w:headerReference w:type="default" r:id="Rc4bb086054b242f7"/>
-      <w:footerReference w:type="default" r:id="R704fddd8d1fc4309"/>
+      <w:headerReference w:type="default" r:id="Rabe97339ef404a10"/>
+      <w:footerReference w:type="default" r:id="Ra2656ddf1b9642a9"/>
       <w:pgSz w:w="11906" w:h="16838"/>
       <w:pgMar w:top="1440" w:right="1440" w:bottom="1440" w:left="1440" w:header="576" w:footer="576" w:gutter="0"/>
     </w:sectPr>
@@ -1650,16 +1650,17 @@
 </file>
 
 <file path=customXml/item.xml><?xml version="1.0" encoding="utf-8"?>
-<marksmithSource schema="marksmith-source-v1" version="3.1.0.0" exportedUtc="2026-09-07T13:27:37.4915322Z" theme="GitHub Light" mermaidMode="1">
+<marksmithSource schema="marksmith-source-v1" version="3.1.0.0" exportedUtc="2026-09-11T06:01:37.0792583Z" theme="GitHub Light" mermaidMode="1">
   <markdown><![CDATA[> [!WARNING]
 > **Raw Export (Without MarkSmith):** This document illustrates standard uncleaned AI copy-paste into Word. Notice the unparsed `\(` math delimiters, citation pips `【12†source】`, clipboard button text (`Copy code`), and stray tokens below.
 # Understanding Gradient Descent
 Great question! Here's a clear walkthrough of how gradient descent actually works 【12†source】.
-**The core idea:** we want to minimise a loss function \( L(\theta) \) by repeatedly stepping in the
-direction that reduces it fastest — the negative gradient. Each update looks like:
-\[ \theta_{t+1} = \theta_t - \eta \, \nabla_\theta L(\theta_t) \]
+**The core idea:** we want to minimise a loss function \( L(\theta) \) by repeatedly stepping in the direction that reduces it fastest — the negative gradient. Each update looks like:
+\[
+\theta_{t+1} = \theta_t - \eta \nabla_\theta L(\theta_t)
+\]
 where \( \eta \) is the **learning rate**.
-## A minimal implementation
+### A minimal implementation
 ```python
 import numpy as np
 def gradient_descent(grad, theta, lr=0.1, steps=100):
@@ -1668,13 +1669,13 @@
     return theta
 ```
 Copy code
-## Choosing the learning rate 【3†source】
+### Choosing the learning rate 【3†source】
 - Too **small** → training crawls and may never converge in reasonable time
 - Too **large** → the loss oscillates or diverges entirely :contentReference[oaicite:0]{index=0}
 - A good default is to start around `1e-3` and tune from there
-## Variants worth knowing
+### Variants worth knowing
 | Variant | What changes | Good for |
-| --- | --- | --- |
+| :--- | :--- | :--- |
 | SGD | one sample per step | large datasets |
 | Momentum | accumulates past gradients | ravines / plateaus |
 | Adam | per-parameter adaptive rates | most deep-learning defaults |

</xml_diff>